<commit_message>
embeddings,cosine_similarity and semantic search
</commit_message>
<xml_diff>
--- a/Notes on the project(learning ^0 understanding).docx
+++ b/Notes on the project(learning ^0 understanding).docx
@@ -4062,7 +4062,1257 @@
           <w:bCs/>
         </w:rPr>
       </w:pPr>
-    </w:p>
+      <w:r>
+        <w:rPr>
+          <w:b/>
+          <w:bCs/>
+        </w:rPr>
+        <w:t>What is an embedding?</w:t>
+      </w:r>
+    </w:p>
+    <w:p>
+      <w:pPr>
+        <w:rPr>
+          <w:b/>
+          <w:bCs/>
+        </w:rPr>
+      </w:pPr>
+      <w:r>
+        <w:rPr>
+          <w:b/>
+          <w:bCs/>
+        </w:rPr>
+        <w:t>An embedding is a numerical representation of data—usually text—such that semantically similar pieces of text tend to have similar representations.</w:t>
+      </w:r>
+    </w:p>
+    <w:tbl>
+      <w:tblPr>
+        <w:tblStyle w:val="TableGrid"/>
+        <w:tblW w:w="0" w:type="auto"/>
+        <w:tblLook w:val="04A0" w:firstRow="1" w:lastRow="0" w:firstColumn="1" w:lastColumn="0" w:noHBand="0" w:noVBand="1"/>
+      </w:tblPr>
+      <w:tblGrid>
+        <w:gridCol w:w="4508"/>
+        <w:gridCol w:w="4508"/>
+      </w:tblGrid>
+      <w:tr>
+        <w:tc>
+          <w:tcPr>
+            <w:tcW w:w="4508" w:type="dxa"/>
+          </w:tcPr>
+          <w:p>
+            <w:r>
+              <w:t>For example:</w:t>
+            </w:r>
+          </w:p>
+          <w:p>
+            <w:r>
+              <w:t>Text A:</w:t>
+            </w:r>
+          </w:p>
+          <w:p>
+            <w:r>
+              <w:lastRenderedPageBreak/>
+              <w:t>"I love this phone."</w:t>
+            </w:r>
+          </w:p>
+          <w:p/>
+          <w:p>
+            <w:r>
+              <w:t>Text B:</w:t>
+            </w:r>
+          </w:p>
+          <w:p>
+            <w:r>
+              <w:t>"This smartphone is excellent."</w:t>
+            </w:r>
+          </w:p>
+          <w:p/>
+          <w:p>
+            <w:r>
+              <w:t>Text C:</w:t>
+            </w:r>
+          </w:p>
+          <w:p>
+            <w:r>
+              <w:t>"The weather is rainy today."</w:t>
+            </w:r>
+          </w:p>
+          <w:p/>
+        </w:tc>
+        <w:tc>
+          <w:tcPr>
+            <w:tcW w:w="4508" w:type="dxa"/>
+          </w:tcPr>
+          <w:p>
+            <w:r>
+              <w:lastRenderedPageBreak/>
+              <w:t xml:space="preserve">"I love this phone." </w:t>
+            </w:r>
+          </w:p>
+          <w:p>
+            <w:r>
+              <w:t>↓</w:t>
+            </w:r>
+          </w:p>
+          <w:p>
+            <w:r>
+              <w:lastRenderedPageBreak/>
+              <w:t xml:space="preserve"> [0.21, -0.73, 0.42, 0.15, ...] </w:t>
+            </w:r>
+          </w:p>
+          <w:p>
+            <w:r>
+              <w:t xml:space="preserve">"This smartphone is excellent." </w:t>
+            </w:r>
+          </w:p>
+          <w:p>
+            <w:r>
+              <w:t xml:space="preserve">↓ </w:t>
+            </w:r>
+          </w:p>
+          <w:p>
+            <w:r>
+              <w:t xml:space="preserve">[0.19, -0.70, 0.45, 0.18, ...] </w:t>
+            </w:r>
+          </w:p>
+          <w:p>
+            <w:r>
+              <w:t xml:space="preserve">"The weather is rainy today." </w:t>
+            </w:r>
+          </w:p>
+          <w:p>
+            <w:r>
+              <w:t xml:space="preserve">↓ </w:t>
+            </w:r>
+          </w:p>
+          <w:p>
+            <w:r>
+              <w:t>[-0.81, 0.12, -0.55, 0.67, ...]</w:t>
+            </w:r>
+          </w:p>
+        </w:tc>
+      </w:tr>
+    </w:tbl>
+    <w:p/>
+    <w:p>
+      <w:r>
+        <w:rPr>
+          <w:b/>
+          <w:bCs/>
+        </w:rPr>
+        <w:t>The actual vectors are much larger</w:t>
+      </w:r>
+      <w:r>
+        <w:t xml:space="preserve"> than this example. I'm keeping them short just for visualization.</w:t>
+      </w:r>
+    </w:p>
+    <w:p>
+      <w:r>
+        <w:t>The important idea:</w:t>
+      </w:r>
+    </w:p>
+    <w:p>
+      <w:r>
+        <w:t>Similar meaning</w:t>
+      </w:r>
+    </w:p>
+    <w:p>
+      <w:r>
+        <w:t xml:space="preserve">      ↓</w:t>
+      </w:r>
+    </w:p>
+    <w:p>
+      <w:r>
+        <w:t>Similar vectors</w:t>
+      </w:r>
+    </w:p>
+    <w:p>
+      <w:r>
+        <w:t xml:space="preserve">      ↓</w:t>
+      </w:r>
+    </w:p>
+    <w:p>
+      <w:r>
+        <w:t>Small distance</w:t>
+      </w:r>
+    </w:p>
+    <w:p>
+      <w:r>
+        <w:t>Different meaning</w:t>
+      </w:r>
+    </w:p>
+    <w:p>
+      <w:r>
+        <w:t xml:space="preserve">      ↓</w:t>
+      </w:r>
+    </w:p>
+    <w:p>
+      <w:r>
+        <w:t>Different vectors</w:t>
+      </w:r>
+    </w:p>
+    <w:p>
+      <w:r>
+        <w:t xml:space="preserve">      ↓</w:t>
+      </w:r>
+    </w:p>
+    <w:p>
+      <w:r>
+        <w:t>Larger distance</w:t>
+      </w:r>
+    </w:p>
+    <w:p>
+      <w:pPr>
+        <w:rPr>
+          <w:b/>
+          <w:bCs/>
+        </w:rPr>
+      </w:pPr>
+      <w:r>
+        <w:rPr>
+          <w:b/>
+          <w:bCs/>
+        </w:rPr>
+        <w:t>2. Why do we need embeddings?</w:t>
+      </w:r>
+    </w:p>
+    <w:p>
+      <w:r>
+        <w:t>Suppose you have a company knowledge base containing:</w:t>
+      </w:r>
+    </w:p>
+    <w:p>
+      <w:r>
+        <w:t>Document 1:</w:t>
+      </w:r>
+    </w:p>
+    <w:p>
+      <w:r>
+        <w:t>"Employees receive 20 days of annual leave."</w:t>
+      </w:r>
+    </w:p>
+    <w:p>
+      <w:r>
+        <w:t>Document 2:</w:t>
+      </w:r>
+    </w:p>
+    <w:p>
+      <w:r>
+        <w:t>"Employees can work remotely on Fridays."</w:t>
+      </w:r>
+    </w:p>
+    <w:p>
+      <w:r>
+        <w:t>Document 3:</w:t>
+      </w:r>
+    </w:p>
+    <w:p>
+      <w:r>
+        <w:t>"The company provides medical insurance."</w:t>
+      </w:r>
+    </w:p>
+    <w:p>
+      <w:r>
+        <w:t>A user asks:</w:t>
+      </w:r>
+    </w:p>
+    <w:p>
+      <w:r>
+        <w:lastRenderedPageBreak/>
+        <w:t>"How many vacation days do employees get?"</w:t>
+      </w:r>
+    </w:p>
+    <w:p>
+      <w:r>
+        <w:t xml:space="preserve">Notice that the user didn't use the exact phrase </w:t>
+      </w:r>
+      <w:r>
+        <w:rPr>
+          <w:b/>
+          <w:bCs/>
+        </w:rPr>
+        <w:t>"annual leave."</w:t>
+      </w:r>
+    </w:p>
+    <w:p>
+      <w:r>
+        <w:t>A traditional keyword search might struggle because:</w:t>
+      </w:r>
+    </w:p>
+    <w:p>
+      <w:r>
+        <w:t xml:space="preserve">vacation </w:t>
+      </w:r>
+      <w:proofErr w:type="gramStart"/>
+      <w:r>
+        <w:t>days  ≠</w:t>
+      </w:r>
+      <w:proofErr w:type="gramEnd"/>
+      <w:r>
+        <w:t xml:space="preserve">   </w:t>
+      </w:r>
+      <w:r>
+        <w:t>annual leave</w:t>
+      </w:r>
+    </w:p>
+    <w:p>
+      <w:r>
+        <w:t>Conceptually:</w:t>
+      </w:r>
+    </w:p>
+    <w:p>
+      <w:r>
+        <w:t>User question</w:t>
+      </w:r>
+    </w:p>
+    <w:p>
+      <w:r>
+        <w:t>"How many vacation days do employees get?"</w:t>
+      </w:r>
+    </w:p>
+    <w:p>
+      <w:r>
+        <w:t xml:space="preserve">             ↓</w:t>
+      </w:r>
+    </w:p>
+    <w:p>
+      <w:r>
+        <w:t xml:space="preserve">        Embedding</w:t>
+      </w:r>
+    </w:p>
+    <w:p>
+      <w:r>
+        <w:t xml:space="preserve">             ↓</w:t>
+      </w:r>
+    </w:p>
+    <w:p>
+      <w:r>
+        <w:t xml:space="preserve">       [vector]</w:t>
+      </w:r>
+    </w:p>
+    <w:p>
+      <w:r>
+        <w:t xml:space="preserve">             ↓</w:t>
+      </w:r>
+    </w:p>
+    <w:p>
+      <w:r>
+        <w:t>Compare with document vectors</w:t>
+      </w:r>
+    </w:p>
+    <w:p>
+      <w:r>
+        <w:t xml:space="preserve">             ↓</w:t>
+      </w:r>
+    </w:p>
+    <w:p>
+      <w:r>
+        <w:t>Document 1 is most similar</w:t>
+      </w:r>
+    </w:p>
+    <w:p>
+      <w:r>
+        <w:t xml:space="preserve">             ↓</w:t>
+      </w:r>
+    </w:p>
+    <w:p>
+      <w:r>
+        <w:t>Retrieve Document 1</w:t>
+      </w:r>
+    </w:p>
+    <w:p>
+      <w:r>
+        <w:t xml:space="preserve">This is the foundation of </w:t>
+      </w:r>
+      <w:r>
+        <w:rPr>
+          <w:b/>
+          <w:bCs/>
+        </w:rPr>
+        <w:t>semantic search</w:t>
+      </w:r>
+      <w:r>
+        <w:t>.</w:t>
+      </w:r>
+    </w:p>
+    <w:p>
+      <w:pPr>
+        <w:rPr>
+          <w:b/>
+          <w:bCs/>
+        </w:rPr>
+      </w:pPr>
+      <w:r>
+        <w:rPr>
+          <w:b/>
+          <w:bCs/>
+        </w:rPr>
+        <w:t>3. Embeddings are NOT generated by the LLM itself necessarily</w:t>
+      </w:r>
+    </w:p>
+    <w:p>
+      <w:r>
+        <w:t>This distinction is important.</w:t>
+      </w:r>
+    </w:p>
+    <w:p>
+      <w:r>
+        <w:t>We have:</w:t>
+      </w:r>
+    </w:p>
+    <w:p>
+      <w:pPr>
+        <w:rPr>
+          <w:b/>
+          <w:bCs/>
+        </w:rPr>
+      </w:pPr>
+      <w:r>
+        <w:rPr>
+          <w:b/>
+          <w:bCs/>
+        </w:rPr>
+        <w:t>Generative model</w:t>
+      </w:r>
+    </w:p>
+    <w:p>
+      <w:r>
+        <w:t>Prompt</w:t>
+      </w:r>
+    </w:p>
+    <w:p>
+      <w:r>
+        <w:t xml:space="preserve">  ↓</w:t>
+      </w:r>
+    </w:p>
+    <w:p>
+      <w:r>
+        <w:t>LLM</w:t>
+      </w:r>
+    </w:p>
+    <w:p>
+      <w:r>
+        <w:t xml:space="preserve">  ↓</w:t>
+      </w:r>
+    </w:p>
+    <w:p>
+      <w:r>
+        <w:t>Text</w:t>
+      </w:r>
+    </w:p>
+    <w:p>
+      <w:r>
+        <w:t>Example:</w:t>
+      </w:r>
+    </w:p>
+    <w:p>
+      <w:r>
+        <w:lastRenderedPageBreak/>
+        <w:t>"Explain SQL joins"</w:t>
+      </w:r>
+    </w:p>
+    <w:p>
+      <w:r>
+        <w:t xml:space="preserve">       ↓</w:t>
+      </w:r>
+    </w:p>
+    <w:p>
+      <w:r>
+        <w:t xml:space="preserve">      LLM</w:t>
+      </w:r>
+    </w:p>
+    <w:p>
+      <w:r>
+        <w:t xml:space="preserve">       ↓</w:t>
+      </w:r>
+    </w:p>
+    <w:p>
+      <w:r>
+        <w:t>"SQL joins combine..."</w:t>
+      </w:r>
+    </w:p>
+    <w:p>
+      <w:pPr>
+        <w:rPr>
+          <w:b/>
+          <w:bCs/>
+        </w:rPr>
+      </w:pPr>
+      <w:r>
+        <w:rPr>
+          <w:b/>
+          <w:bCs/>
+        </w:rPr>
+        <w:t>Embedding model</w:t>
+      </w:r>
+    </w:p>
+    <w:p>
+      <w:r>
+        <w:t>Text</w:t>
+      </w:r>
+    </w:p>
+    <w:p>
+      <w:r>
+        <w:t xml:space="preserve"> ↓</w:t>
+      </w:r>
+    </w:p>
+    <w:p>
+      <w:r>
+        <w:t>Embedding model</w:t>
+      </w:r>
+    </w:p>
+    <w:p>
+      <w:r>
+        <w:t xml:space="preserve"> ↓</w:t>
+      </w:r>
+    </w:p>
+    <w:p>
+      <w:r>
+        <w:t>Vector</w:t>
+      </w:r>
+    </w:p>
+    <w:p>
+      <w:r>
+        <w:t>Example:</w:t>
+      </w:r>
+    </w:p>
+    <w:p>
+      <w:r>
+        <w:t>"Explain SQL joins"</w:t>
+      </w:r>
+    </w:p>
+    <w:p>
+      <w:r>
+        <w:t xml:space="preserve">       ↓</w:t>
+      </w:r>
+    </w:p>
+    <w:p>
+      <w:r>
+        <w:t>Embedding model</w:t>
+      </w:r>
+    </w:p>
+    <w:p>
+      <w:r>
+        <w:t xml:space="preserve">       ↓</w:t>
+      </w:r>
+    </w:p>
+    <w:p>
+      <w:r>
+        <w:t>[0.12, -0.43, 0.71, ...]</w:t>
+      </w:r>
+    </w:p>
+    <w:p>
+      <w:r>
+        <w:t xml:space="preserve">An embedding model is optimized for </w:t>
+      </w:r>
+      <w:r>
+        <w:rPr>
+          <w:b/>
+          <w:bCs/>
+        </w:rPr>
+        <w:t>representing meaning</w:t>
+      </w:r>
+      <w:r>
+        <w:t>, rather than generating an answer.</w:t>
+      </w:r>
+    </w:p>
+    <w:p>
+      <w:pPr>
+        <w:rPr>
+          <w:b/>
+          <w:bCs/>
+        </w:rPr>
+      </w:pPr>
+      <w:r>
+        <w:rPr>
+          <w:b/>
+          <w:bCs/>
+        </w:rPr>
+        <w:t>4. What is a vector?</w:t>
+      </w:r>
+    </w:p>
+    <w:p>
+      <w:r>
+        <w:t>A vector is simply an ordered collection of numbers.</w:t>
+      </w:r>
+    </w:p>
+    <w:p>
+      <w:r>
+        <w:t>For example:</w:t>
+      </w:r>
+    </w:p>
+    <w:p>
+      <w:r>
+        <w:t>vector = [0.25, -0.81, 0.43, 0.19]</w:t>
+      </w:r>
+    </w:p>
+    <w:p>
+      <w:r>
+        <w:t>You can think of it as a point in a mathematical space.</w:t>
+      </w:r>
+    </w:p>
+    <w:p>
+      <w:r>
+        <w:t>If two texts have similar meanings, their vectors tend to be located relatively close to each other in the embedding space.</w:t>
+      </w:r>
+    </w:p>
+    <w:p>
+      <w:r>
+        <w:t xml:space="preserve">Of course, real embedding spaces can have </w:t>
+      </w:r>
+      <w:r>
+        <w:rPr>
+          <w:b/>
+          <w:bCs/>
+        </w:rPr>
+        <w:t>hundreds or thousands of dimensions</w:t>
+      </w:r>
+      <w:r>
+        <w:t>, not just two.</w:t>
+      </w:r>
+    </w:p>
+    <w:p/>
+    <w:p>
+      <w:pPr>
+        <w:rPr>
+          <w:b/>
+          <w:bCs/>
+        </w:rPr>
+      </w:pPr>
+      <w:r>
+        <w:rPr>
+          <w:b/>
+          <w:bCs/>
+        </w:rPr>
+        <w:lastRenderedPageBreak/>
+        <w:t>5. How do we measure similarity?</w:t>
+      </w:r>
+    </w:p>
+    <w:p>
+      <w:r>
+        <w:t xml:space="preserve">One very important technique is </w:t>
+      </w:r>
+      <w:r>
+        <w:rPr>
+          <w:b/>
+          <w:bCs/>
+        </w:rPr>
+        <w:t>cosine similarity</w:t>
+      </w:r>
+      <w:r>
+        <w:t>.</w:t>
+      </w:r>
+    </w:p>
+    <w:p>
+      <w:r>
+        <w:t>Conceptually:</w:t>
+      </w:r>
+    </w:p>
+    <w:p>
+      <w:r>
+        <w:t>Vector A</w:t>
+      </w:r>
+    </w:p>
+    <w:p>
+      <w:r>
+        <w:t xml:space="preserve">   ↘</w:t>
+      </w:r>
+    </w:p>
+    <w:p>
+      <w:r>
+        <w:t xml:space="preserve">    \ </w:t>
+      </w:r>
+      <w:proofErr w:type="gramStart"/>
+      <w:r>
+        <w:t>angle</w:t>
+      </w:r>
+      <w:proofErr w:type="gramEnd"/>
+    </w:p>
+    <w:p>
+      <w:r>
+        <w:t xml:space="preserve">     ↘</w:t>
+      </w:r>
+    </w:p>
+    <w:p>
+      <w:r>
+        <w:t xml:space="preserve">      Vector B</w:t>
+      </w:r>
+    </w:p>
+    <w:p>
+      <w:r>
+        <w:t>Cosine similarity measures how similar the directions of two vectors are.</w:t>
+      </w:r>
+    </w:p>
+    <w:p>
+      <w:r>
+        <w:t>Roughly:</w:t>
+      </w:r>
+    </w:p>
+    <w:p>
+      <w:r>
+        <w:t>+</w:t>
+      </w:r>
+      <w:proofErr w:type="gramStart"/>
+      <w:r>
+        <w:t>1  →</w:t>
+      </w:r>
+      <w:proofErr w:type="gramEnd"/>
+      <w:r>
+        <w:t xml:space="preserve"> very similar direction</w:t>
+      </w:r>
+    </w:p>
+    <w:p>
+      <w:r>
+        <w:t xml:space="preserve"> </w:t>
+      </w:r>
+      <w:proofErr w:type="gramStart"/>
+      <w:r>
+        <w:t>0  →</w:t>
+      </w:r>
+      <w:proofErr w:type="gramEnd"/>
+      <w:r>
+        <w:t xml:space="preserve"> little/no directional similarity</w:t>
+      </w:r>
+    </w:p>
+    <w:p>
+      <w:r>
+        <w:t>-</w:t>
+      </w:r>
+      <w:proofErr w:type="gramStart"/>
+      <w:r>
+        <w:t>1  →</w:t>
+      </w:r>
+      <w:proofErr w:type="gramEnd"/>
+      <w:r>
+        <w:t xml:space="preserve"> opposite direction</w:t>
+      </w:r>
+    </w:p>
+    <w:p>
+      <w:r>
+        <w:t>For many modern embedding applications, cosine similarity is commonly used.</w:t>
+      </w:r>
+    </w:p>
+    <w:p>
+      <w:r>
+        <w:t>You'll eventually code this ourselves.</w:t>
+      </w:r>
+    </w:p>
+    <w:p>
+      <w:r>
+        <w:rPr>
+          <w:b/>
+          <w:bCs/>
+        </w:rPr>
+        <w:t>Cosine Similarity</w:t>
+      </w:r>
+      <w:r>
+        <w:rPr>
+          <w:b/>
+          <w:bCs/>
+        </w:rPr>
+        <w:br/>
+      </w:r>
+      <w:r>
+        <w:t xml:space="preserve">Cosine similarity primarily looks at the </w:t>
+      </w:r>
+      <w:r>
+        <w:rPr>
+          <w:b/>
+          <w:bCs/>
+        </w:rPr>
+        <w:t>angle between the vectors</w:t>
+      </w:r>
+      <w:r>
+        <w:t>.</w:t>
+      </w:r>
+    </w:p>
+    <w:p>
+      <w:pPr>
+        <w:numPr>
+          <w:ilvl w:val="0"/>
+          <w:numId w:val="10"/>
+        </w:numPr>
+      </w:pPr>
+      <w:r>
+        <w:t xml:space="preserve">Same direction → similarity close to </w:t>
+      </w:r>
+      <w:r>
+        <w:rPr>
+          <w:b/>
+          <w:bCs/>
+        </w:rPr>
+        <w:t>1</w:t>
+      </w:r>
+      <w:r>
+        <w:t xml:space="preserve"> </w:t>
+      </w:r>
+    </w:p>
+    <w:p>
+      <w:pPr>
+        <w:numPr>
+          <w:ilvl w:val="0"/>
+          <w:numId w:val="10"/>
+        </w:numPr>
+      </w:pPr>
+      <w:r>
+        <w:t xml:space="preserve">Roughly perpendicular → similarity around </w:t>
+      </w:r>
+      <w:r>
+        <w:rPr>
+          <w:b/>
+          <w:bCs/>
+        </w:rPr>
+        <w:t>0</w:t>
+      </w:r>
+      <w:r>
+        <w:t xml:space="preserve"> </w:t>
+      </w:r>
+    </w:p>
+    <w:p>
+      <w:pPr>
+        <w:numPr>
+          <w:ilvl w:val="0"/>
+          <w:numId w:val="10"/>
+        </w:numPr>
+      </w:pPr>
+      <w:r>
+        <w:t xml:space="preserve">Opposite direction → similarity can approach </w:t>
+      </w:r>
+      <w:r>
+        <w:rPr>
+          <w:b/>
+          <w:bCs/>
+        </w:rPr>
+        <w:t>-1</w:t>
+      </w:r>
+      <w:r>
+        <w:t xml:space="preserve"> </w:t>
+      </w:r>
+    </w:p>
+    <w:p>
+      <w:r>
+        <w:t>For semantic embeddings, higher similarity generally means the texts are more semantically related.</w:t>
+      </w:r>
+    </w:p>
+    <w:p>
+      <w:r>
+        <w:t>cosine </w:t>
+      </w:r>
+      <w:proofErr w:type="gramStart"/>
+      <w:r>
+        <w:t>similarity(</w:t>
+      </w:r>
+      <w:proofErr w:type="gramEnd"/>
+      <w:r>
+        <w:t>A,</w:t>
+      </w:r>
+      <w:r>
+        <w:t xml:space="preserve"> </w:t>
+      </w:r>
+      <w:r>
+        <w:t>B)</w:t>
+      </w:r>
+      <w:r>
+        <w:t xml:space="preserve"> </w:t>
+      </w:r>
+      <w:r>
+        <w:t>=</w:t>
+      </w:r>
+      <w:r>
+        <w:rPr>
+          <w:rFonts w:ascii="Cambria Math" w:hAnsi="Cambria Math" w:cs="Cambria Math"/>
+        </w:rPr>
+        <w:t xml:space="preserve"> </w:t>
+      </w:r>
+      <w:r>
+        <w:t>A</w:t>
+      </w:r>
+      <w:r>
+        <w:rPr>
+          <w:rFonts w:ascii="Cambria Math" w:hAnsi="Cambria Math" w:cs="Cambria Math"/>
+        </w:rPr>
+        <w:t>⋅</w:t>
+      </w:r>
+      <w:r>
+        <w:t>B</w:t>
+      </w:r>
+      <w:r>
+        <w:rPr>
+          <w:rFonts w:ascii="Calibri" w:hAnsi="Calibri" w:cs="Calibri"/>
+        </w:rPr>
+        <w:t>​</w:t>
+      </w:r>
+      <w:r>
+        <w:rPr>
+          <w:rFonts w:ascii="Calibri" w:hAnsi="Calibri" w:cs="Calibri"/>
+        </w:rPr>
+        <w:t xml:space="preserve"> / </w:t>
+      </w:r>
+      <w:r>
+        <w:rPr>
+          <w:rFonts w:ascii="Cambria Math" w:hAnsi="Cambria Math" w:cs="Cambria Math"/>
+        </w:rPr>
+        <w:t>∣∣</w:t>
+      </w:r>
+      <w:r>
+        <w:t>A</w:t>
+      </w:r>
+      <w:r>
+        <w:rPr>
+          <w:rFonts w:ascii="Cambria Math" w:hAnsi="Cambria Math" w:cs="Cambria Math"/>
+        </w:rPr>
+        <w:t>∣∣</w:t>
+      </w:r>
+      <w:r>
+        <w:rPr>
+          <w:rFonts w:ascii="Cambria Math" w:hAnsi="Cambria Math" w:cs="Cambria Math"/>
+        </w:rPr>
+        <w:t xml:space="preserve"> </w:t>
+      </w:r>
+      <w:r>
+        <w:rPr>
+          <w:rFonts w:ascii="Cambria Math" w:hAnsi="Cambria Math" w:cs="Cambria Math"/>
+        </w:rPr>
+        <w:t>∣∣</w:t>
+      </w:r>
+      <w:r>
+        <w:t>B</w:t>
+      </w:r>
+      <w:r>
+        <w:rPr>
+          <w:rFonts w:ascii="Cambria Math" w:hAnsi="Cambria Math" w:cs="Cambria Math"/>
+        </w:rPr>
+        <w:t>∣∣</w:t>
+      </w:r>
+    </w:p>
+    <w:p>
+      <w:r>
+        <w:t>Where:</w:t>
+      </w:r>
+    </w:p>
+    <w:p>
+      <w:pPr>
+        <w:numPr>
+          <w:ilvl w:val="0"/>
+          <w:numId w:val="11"/>
+        </w:numPr>
+      </w:pPr>
+      <w:proofErr w:type="gramStart"/>
+      <w:r>
+        <w:t>np.dot(</w:t>
+      </w:r>
+      <w:proofErr w:type="gramEnd"/>
+      <w:r>
+        <w:t xml:space="preserve">a, b) → dot product </w:t>
+      </w:r>
+    </w:p>
+    <w:p>
+      <w:pPr>
+        <w:numPr>
+          <w:ilvl w:val="0"/>
+          <w:numId w:val="11"/>
+        </w:numPr>
+      </w:pPr>
+      <w:proofErr w:type="spellStart"/>
+      <w:proofErr w:type="gramStart"/>
+      <w:r>
+        <w:t>np.linalg</w:t>
+      </w:r>
+      <w:proofErr w:type="gramEnd"/>
+      <w:r>
+        <w:t>.norm</w:t>
+      </w:r>
+      <w:proofErr w:type="spellEnd"/>
+      <w:r>
+        <w:t xml:space="preserve">(a) → magnitude/length of vector A </w:t>
+      </w:r>
+    </w:p>
+    <w:p>
+      <w:pPr>
+        <w:numPr>
+          <w:ilvl w:val="0"/>
+          <w:numId w:val="11"/>
+        </w:numPr>
+      </w:pPr>
+      <w:proofErr w:type="spellStart"/>
+      <w:proofErr w:type="gramStart"/>
+      <w:r>
+        <w:t>np.linalg</w:t>
+      </w:r>
+      <w:proofErr w:type="gramEnd"/>
+      <w:r>
+        <w:t>.norm</w:t>
+      </w:r>
+      <w:proofErr w:type="spellEnd"/>
+      <w:r>
+        <w:t>(b) → magnitude/length of vector B</w:t>
+      </w:r>
+    </w:p>
+    <w:p/>
+    <w:p>
+      <w:r>
+        <w:t xml:space="preserve">Imagine we have </w:t>
+      </w:r>
+      <w:r>
+        <w:rPr>
+          <w:b/>
+          <w:bCs/>
+        </w:rPr>
+        <w:t>10,000 company documents</w:t>
+      </w:r>
+      <w:r>
+        <w:t>.</w:t>
+      </w:r>
+    </w:p>
+    <w:p>
+      <w:r>
+        <w:lastRenderedPageBreak/>
+        <w:t>We could create embeddings once:</w:t>
+      </w:r>
+    </w:p>
+    <w:p>
+      <w:r>
+        <w:t>Document 1 → Vector 1</w:t>
+      </w:r>
+    </w:p>
+    <w:p>
+      <w:r>
+        <w:t>Document 2 → Vector 2</w:t>
+      </w:r>
+    </w:p>
+    <w:p>
+      <w:r>
+        <w:t>Document 3 → Vector 3</w:t>
+      </w:r>
+    </w:p>
+    <w:p>
+      <w:r>
+        <w:t>...</w:t>
+      </w:r>
+    </w:p>
+    <w:p>
+      <w:r>
+        <w:t>Document 10000 → Vector 10000</w:t>
+      </w:r>
+    </w:p>
+    <w:p>
+      <w:r>
+        <w:t>Then a user asks:</w:t>
+      </w:r>
+    </w:p>
+    <w:p>
+      <w:r>
+        <w:t>"How many days of annual leave do employees receive?"</w:t>
+      </w:r>
+    </w:p>
+    <w:p>
+      <w:r>
+        <w:t>We embed the question:</w:t>
+      </w:r>
+    </w:p>
+    <w:p>
+      <w:r>
+        <w:t>Question</w:t>
+      </w:r>
+    </w:p>
+    <w:p>
+      <w:r>
+        <w:t xml:space="preserve">   ↓</w:t>
+      </w:r>
+    </w:p>
+    <w:p>
+      <w:r>
+        <w:t>Embedding model</w:t>
+      </w:r>
+    </w:p>
+    <w:p>
+      <w:r>
+        <w:t xml:space="preserve">   ↓</w:t>
+      </w:r>
+    </w:p>
+    <w:p>
+      <w:r>
+        <w:t>Query vector</w:t>
+      </w:r>
+    </w:p>
+    <w:p>
+      <w:r>
+        <w:t>Then compare:</w:t>
+      </w:r>
+    </w:p>
+    <w:p>
+      <w:r>
+        <w:t>Query vector</w:t>
+      </w:r>
+    </w:p>
+    <w:p>
+      <w:r>
+        <w:t xml:space="preserve">      ↓</w:t>
+      </w:r>
+    </w:p>
+    <w:p>
+      <w:r>
+        <w:t>Similarity with Vector 1</w:t>
+      </w:r>
+    </w:p>
+    <w:p>
+      <w:r>
+        <w:t>Similarity with Vector 2</w:t>
+      </w:r>
+    </w:p>
+    <w:p>
+      <w:r>
+        <w:t>Similarity with Vector 3</w:t>
+      </w:r>
+    </w:p>
+    <w:p>
+      <w:r>
+        <w:t>...</w:t>
+      </w:r>
+    </w:p>
+    <w:p>
+      <w:r>
+        <w:t>Similarity with Vector 10000</w:t>
+      </w:r>
+    </w:p>
+    <w:p>
+      <w:r>
+        <w:t>Then:</w:t>
+      </w:r>
+    </w:p>
+    <w:p>
+      <w:r>
+        <w:t>Highest similarity</w:t>
+      </w:r>
+    </w:p>
+    <w:p>
+      <w:r>
+        <w:t xml:space="preserve">       ↓</w:t>
+      </w:r>
+    </w:p>
+    <w:p>
+      <w:r>
+        <w:t>Most relevant documents</w:t>
+      </w:r>
+    </w:p>
+    <w:p>
+      <w:r>
+        <w:t xml:space="preserve">That's </w:t>
+      </w:r>
+      <w:r>
+        <w:rPr>
+          <w:b/>
+          <w:bCs/>
+        </w:rPr>
+        <w:t>semantic retrieval</w:t>
+      </w:r>
+      <w:r>
+        <w:t>.</w:t>
+      </w:r>
+      <w:r>
+        <w:t xml:space="preserve"> </w:t>
+      </w:r>
+      <w:r>
+        <w:t>And this is the critical bridge:</w:t>
+      </w:r>
+    </w:p>
+    <w:p>
+      <w:r>
+        <w:t xml:space="preserve">             EMBEDDINGS</w:t>
+      </w:r>
+    </w:p>
+    <w:p>
+      <w:r>
+        <w:lastRenderedPageBreak/>
+        <w:t xml:space="preserve">                 ↓</w:t>
+      </w:r>
+    </w:p>
+    <w:p>
+      <w:r>
+        <w:t xml:space="preserve">          Vector similarity</w:t>
+      </w:r>
+    </w:p>
+    <w:p>
+      <w:r>
+        <w:t xml:space="preserve">                 ↓</w:t>
+      </w:r>
+    </w:p>
+    <w:p>
+      <w:r>
+        <w:t xml:space="preserve">            Retrieval</w:t>
+      </w:r>
+    </w:p>
+    <w:p>
+      <w:r>
+        <w:t xml:space="preserve">                 ↓</w:t>
+      </w:r>
+    </w:p>
+    <w:p>
+      <w:r>
+        <w:t xml:space="preserve">               RAG</w:t>
+      </w:r>
+    </w:p>
+    <w:p>
+      <w:pPr>
+        <w:rPr>
+          <w:b/>
+          <w:bCs/>
+        </w:rPr>
+      </w:pPr>
+      <w:proofErr w:type="gramStart"/>
+      <w:r>
+        <w:rPr>
+          <w:b/>
+          <w:bCs/>
+        </w:rPr>
+        <w:t>LLM</w:t>
+      </w:r>
+      <w:r>
+        <w:rPr>
+          <w:b/>
+          <w:bCs/>
+        </w:rPr>
+        <w:t xml:space="preserve"> :</w:t>
+      </w:r>
+      <w:proofErr w:type="gramEnd"/>
+      <w:r>
+        <w:rPr>
+          <w:b/>
+          <w:bCs/>
+        </w:rPr>
+        <w:t xml:space="preserve"> </w:t>
+      </w:r>
+      <w:r>
+        <w:t>Question → Generate answer</w:t>
+      </w:r>
+    </w:p>
+    <w:p>
+      <w:pPr>
+        <w:rPr>
+          <w:b/>
+          <w:bCs/>
+        </w:rPr>
+      </w:pPr>
+      <w:r>
+        <w:rPr>
+          <w:b/>
+          <w:bCs/>
+        </w:rPr>
+        <w:t>Embedding model</w:t>
+      </w:r>
+      <w:r>
+        <w:rPr>
+          <w:b/>
+          <w:bCs/>
+        </w:rPr>
+        <w:t xml:space="preserve">: </w:t>
+      </w:r>
+      <w:r>
+        <w:t>Text A + Text B → Measure semantic relationship</w:t>
+      </w:r>
+    </w:p>
+    <w:p/>
     <w:p/>
     <w:sectPr>
       <w:pgSz w:w="11906" w:h="16838"/>
@@ -4226,6 +5476,155 @@
     </w:lvl>
   </w:abstractNum>
   <w:abstractNum w:abstractNumId="1" w15:restartNumberingAfterBreak="0">
+    <w:nsid w:val="1A7A6122"/>
+    <w:multiLevelType w:val="multilevel"/>
+    <w:tmpl w:val="2C0E6D90"/>
+    <w:lvl w:ilvl="0">
+      <w:start w:val="1"/>
+      <w:numFmt w:val="bullet"/>
+      <w:lvlText w:val=""/>
+      <w:lvlJc w:val="left"/>
+      <w:pPr>
+        <w:tabs>
+          <w:tab w:val="num" w:pos="720"/>
+        </w:tabs>
+        <w:ind w:left="720" w:hanging="360"/>
+      </w:pPr>
+      <w:rPr>
+        <w:rFonts w:ascii="Symbol" w:hAnsi="Symbol" w:hint="default"/>
+        <w:sz w:val="20"/>
+      </w:rPr>
+    </w:lvl>
+    <w:lvl w:ilvl="1" w:tentative="1">
+      <w:start w:val="1"/>
+      <w:numFmt w:val="bullet"/>
+      <w:lvlText w:val="o"/>
+      <w:lvlJc w:val="left"/>
+      <w:pPr>
+        <w:tabs>
+          <w:tab w:val="num" w:pos="1440"/>
+        </w:tabs>
+        <w:ind w:left="1440" w:hanging="360"/>
+      </w:pPr>
+      <w:rPr>
+        <w:rFonts w:ascii="Courier New" w:hAnsi="Courier New" w:hint="default"/>
+        <w:sz w:val="20"/>
+      </w:rPr>
+    </w:lvl>
+    <w:lvl w:ilvl="2" w:tentative="1">
+      <w:start w:val="1"/>
+      <w:numFmt w:val="bullet"/>
+      <w:lvlText w:val=""/>
+      <w:lvlJc w:val="left"/>
+      <w:pPr>
+        <w:tabs>
+          <w:tab w:val="num" w:pos="2160"/>
+        </w:tabs>
+        <w:ind w:left="2160" w:hanging="360"/>
+      </w:pPr>
+      <w:rPr>
+        <w:rFonts w:ascii="Wingdings" w:hAnsi="Wingdings" w:hint="default"/>
+        <w:sz w:val="20"/>
+      </w:rPr>
+    </w:lvl>
+    <w:lvl w:ilvl="3" w:tentative="1">
+      <w:start w:val="1"/>
+      <w:numFmt w:val="bullet"/>
+      <w:lvlText w:val=""/>
+      <w:lvlJc w:val="left"/>
+      <w:pPr>
+        <w:tabs>
+          <w:tab w:val="num" w:pos="2880"/>
+        </w:tabs>
+        <w:ind w:left="2880" w:hanging="360"/>
+      </w:pPr>
+      <w:rPr>
+        <w:rFonts w:ascii="Wingdings" w:hAnsi="Wingdings" w:hint="default"/>
+        <w:sz w:val="20"/>
+      </w:rPr>
+    </w:lvl>
+    <w:lvl w:ilvl="4" w:tentative="1">
+      <w:start w:val="1"/>
+      <w:numFmt w:val="bullet"/>
+      <w:lvlText w:val=""/>
+      <w:lvlJc w:val="left"/>
+      <w:pPr>
+        <w:tabs>
+          <w:tab w:val="num" w:pos="3600"/>
+        </w:tabs>
+        <w:ind w:left="3600" w:hanging="360"/>
+      </w:pPr>
+      <w:rPr>
+        <w:rFonts w:ascii="Wingdings" w:hAnsi="Wingdings" w:hint="default"/>
+        <w:sz w:val="20"/>
+      </w:rPr>
+    </w:lvl>
+    <w:lvl w:ilvl="5" w:tentative="1">
+      <w:start w:val="1"/>
+      <w:numFmt w:val="bullet"/>
+      <w:lvlText w:val=""/>
+      <w:lvlJc w:val="left"/>
+      <w:pPr>
+        <w:tabs>
+          <w:tab w:val="num" w:pos="4320"/>
+        </w:tabs>
+        <w:ind w:left="4320" w:hanging="360"/>
+      </w:pPr>
+      <w:rPr>
+        <w:rFonts w:ascii="Wingdings" w:hAnsi="Wingdings" w:hint="default"/>
+        <w:sz w:val="20"/>
+      </w:rPr>
+    </w:lvl>
+    <w:lvl w:ilvl="6" w:tentative="1">
+      <w:start w:val="1"/>
+      <w:numFmt w:val="bullet"/>
+      <w:lvlText w:val=""/>
+      <w:lvlJc w:val="left"/>
+      <w:pPr>
+        <w:tabs>
+          <w:tab w:val="num" w:pos="5040"/>
+        </w:tabs>
+        <w:ind w:left="5040" w:hanging="360"/>
+      </w:pPr>
+      <w:rPr>
+        <w:rFonts w:ascii="Wingdings" w:hAnsi="Wingdings" w:hint="default"/>
+        <w:sz w:val="20"/>
+      </w:rPr>
+    </w:lvl>
+    <w:lvl w:ilvl="7" w:tentative="1">
+      <w:start w:val="1"/>
+      <w:numFmt w:val="bullet"/>
+      <w:lvlText w:val=""/>
+      <w:lvlJc w:val="left"/>
+      <w:pPr>
+        <w:tabs>
+          <w:tab w:val="num" w:pos="5760"/>
+        </w:tabs>
+        <w:ind w:left="5760" w:hanging="360"/>
+      </w:pPr>
+      <w:rPr>
+        <w:rFonts w:ascii="Wingdings" w:hAnsi="Wingdings" w:hint="default"/>
+        <w:sz w:val="20"/>
+      </w:rPr>
+    </w:lvl>
+    <w:lvl w:ilvl="8" w:tentative="1">
+      <w:start w:val="1"/>
+      <w:numFmt w:val="bullet"/>
+      <w:lvlText w:val=""/>
+      <w:lvlJc w:val="left"/>
+      <w:pPr>
+        <w:tabs>
+          <w:tab w:val="num" w:pos="6480"/>
+        </w:tabs>
+        <w:ind w:left="6480" w:hanging="360"/>
+      </w:pPr>
+      <w:rPr>
+        <w:rFonts w:ascii="Wingdings" w:hAnsi="Wingdings" w:hint="default"/>
+        <w:sz w:val="20"/>
+      </w:rPr>
+    </w:lvl>
+  </w:abstractNum>
+  <w:abstractNum w:abstractNumId="2" w15:restartNumberingAfterBreak="0">
     <w:nsid w:val="3CB65E34"/>
     <w:multiLevelType w:val="multilevel"/>
     <w:tmpl w:val="83FE3E28"/>
@@ -4338,7 +5737,7 @@
       </w:pPr>
     </w:lvl>
   </w:abstractNum>
-  <w:abstractNum w:abstractNumId="2" w15:restartNumberingAfterBreak="0">
+  <w:abstractNum w:abstractNumId="3" w15:restartNumberingAfterBreak="0">
     <w:nsid w:val="41D30435"/>
     <w:multiLevelType w:val="hybridMultilevel"/>
     <w:tmpl w:val="45D2FDA2"/>
@@ -4451,7 +5850,156 @@
       </w:rPr>
     </w:lvl>
   </w:abstractNum>
-  <w:abstractNum w:abstractNumId="3" w15:restartNumberingAfterBreak="0">
+  <w:abstractNum w:abstractNumId="4" w15:restartNumberingAfterBreak="0">
+    <w:nsid w:val="568B5D83"/>
+    <w:multiLevelType w:val="multilevel"/>
+    <w:tmpl w:val="72548708"/>
+    <w:lvl w:ilvl="0">
+      <w:start w:val="1"/>
+      <w:numFmt w:val="bullet"/>
+      <w:lvlText w:val=""/>
+      <w:lvlJc w:val="left"/>
+      <w:pPr>
+        <w:tabs>
+          <w:tab w:val="num" w:pos="720"/>
+        </w:tabs>
+        <w:ind w:left="720" w:hanging="360"/>
+      </w:pPr>
+      <w:rPr>
+        <w:rFonts w:ascii="Symbol" w:hAnsi="Symbol" w:hint="default"/>
+        <w:sz w:val="20"/>
+      </w:rPr>
+    </w:lvl>
+    <w:lvl w:ilvl="1" w:tentative="1">
+      <w:start w:val="1"/>
+      <w:numFmt w:val="bullet"/>
+      <w:lvlText w:val="o"/>
+      <w:lvlJc w:val="left"/>
+      <w:pPr>
+        <w:tabs>
+          <w:tab w:val="num" w:pos="1440"/>
+        </w:tabs>
+        <w:ind w:left="1440" w:hanging="360"/>
+      </w:pPr>
+      <w:rPr>
+        <w:rFonts w:ascii="Courier New" w:hAnsi="Courier New" w:hint="default"/>
+        <w:sz w:val="20"/>
+      </w:rPr>
+    </w:lvl>
+    <w:lvl w:ilvl="2" w:tentative="1">
+      <w:start w:val="1"/>
+      <w:numFmt w:val="bullet"/>
+      <w:lvlText w:val=""/>
+      <w:lvlJc w:val="left"/>
+      <w:pPr>
+        <w:tabs>
+          <w:tab w:val="num" w:pos="2160"/>
+        </w:tabs>
+        <w:ind w:left="2160" w:hanging="360"/>
+      </w:pPr>
+      <w:rPr>
+        <w:rFonts w:ascii="Wingdings" w:hAnsi="Wingdings" w:hint="default"/>
+        <w:sz w:val="20"/>
+      </w:rPr>
+    </w:lvl>
+    <w:lvl w:ilvl="3" w:tentative="1">
+      <w:start w:val="1"/>
+      <w:numFmt w:val="bullet"/>
+      <w:lvlText w:val=""/>
+      <w:lvlJc w:val="left"/>
+      <w:pPr>
+        <w:tabs>
+          <w:tab w:val="num" w:pos="2880"/>
+        </w:tabs>
+        <w:ind w:left="2880" w:hanging="360"/>
+      </w:pPr>
+      <w:rPr>
+        <w:rFonts w:ascii="Wingdings" w:hAnsi="Wingdings" w:hint="default"/>
+        <w:sz w:val="20"/>
+      </w:rPr>
+    </w:lvl>
+    <w:lvl w:ilvl="4" w:tentative="1">
+      <w:start w:val="1"/>
+      <w:numFmt w:val="bullet"/>
+      <w:lvlText w:val=""/>
+      <w:lvlJc w:val="left"/>
+      <w:pPr>
+        <w:tabs>
+          <w:tab w:val="num" w:pos="3600"/>
+        </w:tabs>
+        <w:ind w:left="3600" w:hanging="360"/>
+      </w:pPr>
+      <w:rPr>
+        <w:rFonts w:ascii="Wingdings" w:hAnsi="Wingdings" w:hint="default"/>
+        <w:sz w:val="20"/>
+      </w:rPr>
+    </w:lvl>
+    <w:lvl w:ilvl="5" w:tentative="1">
+      <w:start w:val="1"/>
+      <w:numFmt w:val="bullet"/>
+      <w:lvlText w:val=""/>
+      <w:lvlJc w:val="left"/>
+      <w:pPr>
+        <w:tabs>
+          <w:tab w:val="num" w:pos="4320"/>
+        </w:tabs>
+        <w:ind w:left="4320" w:hanging="360"/>
+      </w:pPr>
+      <w:rPr>
+        <w:rFonts w:ascii="Wingdings" w:hAnsi="Wingdings" w:hint="default"/>
+        <w:sz w:val="20"/>
+      </w:rPr>
+    </w:lvl>
+    <w:lvl w:ilvl="6" w:tentative="1">
+      <w:start w:val="1"/>
+      <w:numFmt w:val="bullet"/>
+      <w:lvlText w:val=""/>
+      <w:lvlJc w:val="left"/>
+      <w:pPr>
+        <w:tabs>
+          <w:tab w:val="num" w:pos="5040"/>
+        </w:tabs>
+        <w:ind w:left="5040" w:hanging="360"/>
+      </w:pPr>
+      <w:rPr>
+        <w:rFonts w:ascii="Wingdings" w:hAnsi="Wingdings" w:hint="default"/>
+        <w:sz w:val="20"/>
+      </w:rPr>
+    </w:lvl>
+    <w:lvl w:ilvl="7" w:tentative="1">
+      <w:start w:val="1"/>
+      <w:numFmt w:val="bullet"/>
+      <w:lvlText w:val=""/>
+      <w:lvlJc w:val="left"/>
+      <w:pPr>
+        <w:tabs>
+          <w:tab w:val="num" w:pos="5760"/>
+        </w:tabs>
+        <w:ind w:left="5760" w:hanging="360"/>
+      </w:pPr>
+      <w:rPr>
+        <w:rFonts w:ascii="Wingdings" w:hAnsi="Wingdings" w:hint="default"/>
+        <w:sz w:val="20"/>
+      </w:rPr>
+    </w:lvl>
+    <w:lvl w:ilvl="8" w:tentative="1">
+      <w:start w:val="1"/>
+      <w:numFmt w:val="bullet"/>
+      <w:lvlText w:val=""/>
+      <w:lvlJc w:val="left"/>
+      <w:pPr>
+        <w:tabs>
+          <w:tab w:val="num" w:pos="6480"/>
+        </w:tabs>
+        <w:ind w:left="6480" w:hanging="360"/>
+      </w:pPr>
+      <w:rPr>
+        <w:rFonts w:ascii="Wingdings" w:hAnsi="Wingdings" w:hint="default"/>
+        <w:sz w:val="20"/>
+      </w:rPr>
+    </w:lvl>
+  </w:abstractNum>
+  <w:abstractNum w:abstractNumId="5" w15:restartNumberingAfterBreak="0">
     <w:nsid w:val="69280462"/>
     <w:multiLevelType w:val="multilevel"/>
     <w:tmpl w:val="A6024E66"/>
@@ -4600,7 +6148,7 @@
       </w:rPr>
     </w:lvl>
   </w:abstractNum>
-  <w:abstractNum w:abstractNumId="4" w15:restartNumberingAfterBreak="0">
+  <w:abstractNum w:abstractNumId="6" w15:restartNumberingAfterBreak="0">
     <w:nsid w:val="6A9229AC"/>
     <w:multiLevelType w:val="multilevel"/>
     <w:tmpl w:val="D4EAA68A"/>
@@ -4749,7 +6297,7 @@
       </w:rPr>
     </w:lvl>
   </w:abstractNum>
-  <w:abstractNum w:abstractNumId="5" w15:restartNumberingAfterBreak="0">
+  <w:abstractNum w:abstractNumId="7" w15:restartNumberingAfterBreak="0">
     <w:nsid w:val="6D7E4728"/>
     <w:multiLevelType w:val="multilevel"/>
     <w:tmpl w:val="1EDAFE38"/>
@@ -4898,7 +6446,7 @@
       </w:rPr>
     </w:lvl>
   </w:abstractNum>
-  <w:abstractNum w:abstractNumId="6" w15:restartNumberingAfterBreak="0">
+  <w:abstractNum w:abstractNumId="8" w15:restartNumberingAfterBreak="0">
     <w:nsid w:val="76207464"/>
     <w:multiLevelType w:val="multilevel"/>
     <w:tmpl w:val="E2988CA2"/>
@@ -5047,7 +6595,7 @@
       </w:rPr>
     </w:lvl>
   </w:abstractNum>
-  <w:abstractNum w:abstractNumId="7" w15:restartNumberingAfterBreak="0">
+  <w:abstractNum w:abstractNumId="9" w15:restartNumberingAfterBreak="0">
     <w:nsid w:val="7CF75E15"/>
     <w:multiLevelType w:val="multilevel"/>
     <w:tmpl w:val="3190D994"/>
@@ -5160,7 +6708,7 @@
       </w:pPr>
     </w:lvl>
   </w:abstractNum>
-  <w:abstractNum w:abstractNumId="8" w15:restartNumberingAfterBreak="0">
+  <w:abstractNum w:abstractNumId="10" w15:restartNumberingAfterBreak="0">
     <w:nsid w:val="7E1E0AF8"/>
     <w:multiLevelType w:val="multilevel"/>
     <w:tmpl w:val="FC0CF3EC"/>
@@ -5310,31 +6858,37 @@
     </w:lvl>
   </w:abstractNum>
   <w:num w:numId="1" w16cid:durableId="482239990">
-    <w:abstractNumId w:val="5"/>
+    <w:abstractNumId w:val="7"/>
   </w:num>
   <w:num w:numId="2" w16cid:durableId="1420834798">
-    <w:abstractNumId w:val="4"/>
+    <w:abstractNumId w:val="6"/>
   </w:num>
   <w:num w:numId="3" w16cid:durableId="1126041032">
-    <w:abstractNumId w:val="7"/>
+    <w:abstractNumId w:val="9"/>
   </w:num>
   <w:num w:numId="4" w16cid:durableId="987057615">
+    <w:abstractNumId w:val="3"/>
+  </w:num>
+  <w:num w:numId="5" w16cid:durableId="1107043784">
+    <w:abstractNumId w:val="8"/>
+  </w:num>
+  <w:num w:numId="6" w16cid:durableId="214440396">
     <w:abstractNumId w:val="2"/>
   </w:num>
-  <w:num w:numId="5" w16cid:durableId="1107043784">
-    <w:abstractNumId w:val="6"/>
-  </w:num>
-  <w:num w:numId="6" w16cid:durableId="214440396">
-    <w:abstractNumId w:val="1"/>
-  </w:num>
   <w:num w:numId="7" w16cid:durableId="444929671">
-    <w:abstractNumId w:val="8"/>
+    <w:abstractNumId w:val="10"/>
   </w:num>
   <w:num w:numId="8" w16cid:durableId="108747670">
-    <w:abstractNumId w:val="3"/>
+    <w:abstractNumId w:val="5"/>
   </w:num>
   <w:num w:numId="9" w16cid:durableId="150223327">
     <w:abstractNumId w:val="0"/>
+  </w:num>
+  <w:num w:numId="10" w16cid:durableId="1591740952">
+    <w:abstractNumId w:val="1"/>
+  </w:num>
+  <w:num w:numId="11" w16cid:durableId="1488327952">
+    <w:abstractNumId w:val="4"/>
   </w:num>
 </w:numbering>
 </file>
@@ -6315,6 +7869,29 @@
       <w:rFonts w:ascii="Times New Roman" w:hAnsi="Times New Roman" w:cs="Times New Roman"/>
     </w:rPr>
   </w:style>
+  <w:style w:type="character" w:styleId="Hyperlink">
+    <w:name w:val="Hyperlink"/>
+    <w:basedOn w:val="DefaultParagraphFont"/>
+    <w:uiPriority w:val="99"/>
+    <w:unhideWhenUsed/>
+    <w:rsid w:val="00AC40DA"/>
+    <w:rPr>
+      <w:color w:val="0563C1" w:themeColor="hyperlink"/>
+      <w:u w:val="single"/>
+    </w:rPr>
+  </w:style>
+  <w:style w:type="character" w:styleId="UnresolvedMention">
+    <w:name w:val="Unresolved Mention"/>
+    <w:basedOn w:val="DefaultParagraphFont"/>
+    <w:uiPriority w:val="99"/>
+    <w:semiHidden/>
+    <w:unhideWhenUsed/>
+    <w:rsid w:val="00AC40DA"/>
+    <w:rPr>
+      <w:color w:val="605E5C"/>
+      <w:shd w:val="clear" w:color="auto" w:fill="E1DFDD"/>
+    </w:rPr>
+  </w:style>
 </w:styles>
 </file>
 

</xml_diff>

<commit_message>
vector database using chromaDB
</commit_message>
<xml_diff>
--- a/Notes on the project(learning ^0 understanding).docx
+++ b/Notes on the project(learning ^0 understanding).docx
@@ -157,13 +157,8 @@
       </w:r>
     </w:p>
     <w:p>
-      <w:proofErr w:type="gramStart"/>
-      <w:r>
-        <w:t>So</w:t>
-      </w:r>
-      <w:proofErr w:type="gramEnd"/>
-      <w:r>
-        <w:t xml:space="preserve"> an LLM fundamentally performs </w:t>
+      <w:r>
+        <w:t xml:space="preserve">So an LLM fundamentally performs </w:t>
       </w:r>
       <w:r>
         <w:rPr>
@@ -557,11 +552,9 @@
       </w:r>
     </w:p>
     <w:p>
-      <w:proofErr w:type="gramStart"/>
       <w:r>
         <w:t>.env</w:t>
       </w:r>
-      <w:proofErr w:type="gramEnd"/>
     </w:p>
     <w:p>
       <w:r>
@@ -632,15 +625,12 @@
       </w:r>
     </w:p>
     <w:p>
-      <w:proofErr w:type="gramStart"/>
       <w:r>
         <w:lastRenderedPageBreak/>
         <w:t>.env</w:t>
       </w:r>
-      <w:proofErr w:type="gramEnd"/>
-    </w:p>
-    <w:p>
-      <w:proofErr w:type="gramStart"/>
+    </w:p>
+    <w:p>
       <w:r>
         <w:t>.</w:t>
       </w:r>
@@ -649,7 +639,6 @@
         <w:t>venv</w:t>
       </w:r>
       <w:proofErr w:type="spellEnd"/>
-      <w:proofErr w:type="gramEnd"/>
       <w:r>
         <w:t>/</w:t>
       </w:r>
@@ -668,7 +657,6 @@
       </w:r>
     </w:p>
     <w:p>
-      <w:proofErr w:type="gramStart"/>
       <w:r>
         <w:t>in .</w:t>
       </w:r>
@@ -677,7 +665,6 @@
         <w:t>gitignore</w:t>
       </w:r>
       <w:proofErr w:type="spellEnd"/>
-      <w:proofErr w:type="gramEnd"/>
       <w:r>
         <w:t>.</w:t>
       </w:r>
@@ -1907,29 +1894,13 @@
     </w:p>
     <w:p>
       <w:r>
-        <w:t>One-</w:t>
-      </w:r>
-      <w:proofErr w:type="gramStart"/>
-      <w:r>
-        <w:t>shot  →</w:t>
-      </w:r>
-      <w:proofErr w:type="gramEnd"/>
-      <w:r>
-        <w:t xml:space="preserve"> 1 example</w:t>
+        <w:t>One-shot  → 1 example</w:t>
       </w:r>
     </w:p>
     <w:p>
       <w:r>
         <w:lastRenderedPageBreak/>
-        <w:t>Few-</w:t>
-      </w:r>
-      <w:proofErr w:type="gramStart"/>
-      <w:r>
-        <w:t>shot  →</w:t>
-      </w:r>
-      <w:proofErr w:type="gramEnd"/>
-      <w:r>
-        <w:t xml:space="preserve"> a small number of examples</w:t>
+        <w:t>Few-shot  → a small number of examples</w:t>
       </w:r>
     </w:p>
     <w:p>
@@ -2017,13 +1988,8 @@
       </w:r>
     </w:p>
     <w:p>
-      <w:proofErr w:type="gramStart"/>
-      <w:r>
-        <w:t>So</w:t>
-      </w:r>
-      <w:proofErr w:type="gramEnd"/>
-      <w:r>
-        <w:t xml:space="preserve"> examples should be </w:t>
+      <w:r>
+        <w:t xml:space="preserve">So examples should be </w:t>
       </w:r>
       <w:r>
         <w:rPr>
@@ -2741,23 +2707,7 @@
           <w:b/>
           <w:bCs/>
         </w:rPr>
-        <w:t xml:space="preserve">Can role </w:t>
-      </w:r>
-      <w:proofErr w:type="gramStart"/>
-      <w:r>
-        <w:rPr>
-          <w:b/>
-          <w:bCs/>
-        </w:rPr>
-        <w:t>prompting</w:t>
-      </w:r>
-      <w:proofErr w:type="gramEnd"/>
-      <w:r>
-        <w:rPr>
-          <w:b/>
-          <w:bCs/>
-        </w:rPr>
-        <w:t xml:space="preserve"> change the model's knowledge?</w:t>
+        <w:t>Can role prompting change the model's knowledge?</w:t>
       </w:r>
     </w:p>
     <w:p>
@@ -2903,13 +2853,8 @@
         <w:t xml:space="preserve">    "</w:t>
       </w:r>
       <w:proofErr w:type="spellStart"/>
-      <w:proofErr w:type="gramStart"/>
-      <w:r>
-        <w:t>positive</w:t>
-      </w:r>
-      <w:proofErr w:type="gramEnd"/>
-      <w:r>
-        <w:t>_aspects</w:t>
+      <w:r>
+        <w:t>positive_aspects</w:t>
       </w:r>
       <w:proofErr w:type="spellEnd"/>
       <w:r>
@@ -2921,13 +2866,8 @@
         <w:t xml:space="preserve">    "</w:t>
       </w:r>
       <w:proofErr w:type="spellStart"/>
-      <w:proofErr w:type="gramStart"/>
-      <w:r>
-        <w:t>negative</w:t>
-      </w:r>
-      <w:proofErr w:type="gramEnd"/>
-      <w:r>
-        <w:t>_aspects</w:t>
+      <w:r>
+        <w:t>negative_aspects</w:t>
       </w:r>
       <w:proofErr w:type="spellEnd"/>
       <w:r>
@@ -3130,18 +3070,10 @@
         <w:t>The two important ones we'll learn first are:</w:t>
       </w:r>
       <w:r>
-        <w:t xml:space="preserve"> 1. Temperature </w:t>
-      </w:r>
-      <w:proofErr w:type="gramStart"/>
-      <w:r>
-        <w:t>2.</w:t>
-      </w:r>
-      <w:r>
-        <w:t>Maximum</w:t>
-      </w:r>
-      <w:proofErr w:type="gramEnd"/>
-      <w:r>
-        <w:t xml:space="preserve"> output tokens</w:t>
+        <w:t xml:space="preserve"> 1. Temperature 2.</w:t>
+      </w:r>
+      <w:r>
+        <w:t>Maximum output tokens</w:t>
       </w:r>
     </w:p>
     <w:p>
@@ -4019,13 +3951,8 @@
       </w:r>
     </w:p>
     <w:p>
-      <w:proofErr w:type="gramStart"/>
-      <w:r>
-        <w:t>So</w:t>
-      </w:r>
-      <w:proofErr w:type="gramEnd"/>
-      <w:r>
-        <w:t xml:space="preserve"> </w:t>
+      <w:r>
+        <w:t xml:space="preserve">So </w:t>
       </w:r>
       <w:r>
         <w:rPr>
@@ -4045,7 +3972,6 @@
           <w:bCs/>
         </w:rPr>
       </w:pPr>
-      <w:proofErr w:type="gramStart"/>
       <w:r>
         <w:rPr>
           <w:b/>
@@ -4053,7 +3979,6 @@
         </w:rPr>
         <w:t>EMBEDDINGS :</w:t>
       </w:r>
-      <w:proofErr w:type="gramEnd"/>
     </w:p>
     <w:p>
       <w:pPr>
@@ -4342,13 +4267,8 @@
     </w:p>
     <w:p>
       <w:r>
-        <w:t xml:space="preserve">vacation </w:t>
-      </w:r>
-      <w:proofErr w:type="gramStart"/>
-      <w:r>
-        <w:t>days  ≠</w:t>
-      </w:r>
-      <w:proofErr w:type="gramEnd"/>
+        <w:t>vacation days  ≠</w:t>
+      </w:r>
       <w:r>
         <w:t xml:space="preserve">   </w:t>
       </w:r>
@@ -4721,13 +4641,8 @@
     </w:p>
     <w:p>
       <w:r>
-        <w:t xml:space="preserve">    \ </w:t>
-      </w:r>
-      <w:proofErr w:type="gramStart"/>
-      <w:r>
-        <w:t>angle</w:t>
-      </w:r>
-      <w:proofErr w:type="gramEnd"/>
+        <w:t xml:space="preserve">    \ angle</w:t>
+      </w:r>
     </w:p>
     <w:p>
       <w:r>
@@ -4751,41 +4666,17 @@
     </w:p>
     <w:p>
       <w:r>
-        <w:t>+</w:t>
-      </w:r>
-      <w:proofErr w:type="gramStart"/>
-      <w:r>
-        <w:t>1  →</w:t>
-      </w:r>
-      <w:proofErr w:type="gramEnd"/>
-      <w:r>
-        <w:t xml:space="preserve"> very similar direction</w:t>
-      </w:r>
-    </w:p>
-    <w:p>
-      <w:r>
-        <w:t xml:space="preserve"> </w:t>
-      </w:r>
-      <w:proofErr w:type="gramStart"/>
-      <w:r>
-        <w:t>0  →</w:t>
-      </w:r>
-      <w:proofErr w:type="gramEnd"/>
-      <w:r>
-        <w:t xml:space="preserve"> little/no directional similarity</w:t>
-      </w:r>
-    </w:p>
-    <w:p>
-      <w:r>
-        <w:t>-</w:t>
-      </w:r>
-      <w:proofErr w:type="gramStart"/>
-      <w:r>
-        <w:t>1  →</w:t>
-      </w:r>
-      <w:proofErr w:type="gramEnd"/>
-      <w:r>
-        <w:t xml:space="preserve"> opposite direction</w:t>
+        <w:t>+1  → very similar direction</w:t>
+      </w:r>
+    </w:p>
+    <w:p>
+      <w:r>
+        <w:t xml:space="preserve"> 0  → little/no directional similarity</w:t>
+      </w:r>
+    </w:p>
+    <w:p>
+      <w:r>
+        <w:t>-1  → opposite direction</w:t>
       </w:r>
     </w:p>
     <w:p>
@@ -4897,15 +4788,7 @@
     </w:p>
     <w:p>
       <w:r>
-        <w:t>cosine </w:t>
-      </w:r>
-      <w:proofErr w:type="gramStart"/>
-      <w:r>
-        <w:t>similarity(</w:t>
-      </w:r>
-      <w:proofErr w:type="gramEnd"/>
-      <w:r>
-        <w:t>A,</w:t>
+        <w:t>cosine similarity(A,</w:t>
       </w:r>
       <w:r>
         <w:t xml:space="preserve"> </w:t>
@@ -4998,13 +4881,8 @@
           <w:numId w:val="11"/>
         </w:numPr>
       </w:pPr>
-      <w:proofErr w:type="gramStart"/>
-      <w:r>
-        <w:t>np.dot(</w:t>
-      </w:r>
-      <w:proofErr w:type="gramEnd"/>
-      <w:r>
-        <w:t xml:space="preserve">a, b) → dot product </w:t>
+      <w:r>
+        <w:t xml:space="preserve">np.dot(a, b) → dot product </w:t>
       </w:r>
     </w:p>
     <w:p>
@@ -5015,13 +4893,8 @@
         </w:numPr>
       </w:pPr>
       <w:proofErr w:type="spellStart"/>
-      <w:proofErr w:type="gramStart"/>
-      <w:r>
-        <w:t>np.linalg</w:t>
-      </w:r>
-      <w:proofErr w:type="gramEnd"/>
-      <w:r>
-        <w:t>.norm</w:t>
+      <w:r>
+        <w:t>np.linalg.norm</w:t>
       </w:r>
       <w:proofErr w:type="spellEnd"/>
       <w:r>
@@ -5036,13 +4909,8 @@
         </w:numPr>
       </w:pPr>
       <w:proofErr w:type="spellStart"/>
-      <w:proofErr w:type="gramStart"/>
-      <w:r>
-        <w:t>np.linalg</w:t>
-      </w:r>
-      <w:proofErr w:type="gramEnd"/>
-      <w:r>
-        <w:t>.norm</w:t>
+      <w:r>
+        <w:t>np.linalg.norm</w:t>
       </w:r>
       <w:proofErr w:type="spellEnd"/>
       <w:r>
@@ -5260,7 +5128,6 @@
           <w:bCs/>
         </w:rPr>
       </w:pPr>
-      <w:proofErr w:type="gramStart"/>
       <w:r>
         <w:rPr>
           <w:b/>
@@ -5273,45 +5140,756 @@
           <w:b/>
           <w:bCs/>
         </w:rPr>
-        <w:t xml:space="preserve"> :</w:t>
-      </w:r>
-      <w:proofErr w:type="gramEnd"/>
-      <w:r>
-        <w:rPr>
-          <w:b/>
-          <w:bCs/>
-        </w:rPr>
+        <w:t xml:space="preserve"> : </w:t>
+      </w:r>
+      <w:r>
+        <w:t>Question → Generate answer</w:t>
+      </w:r>
+    </w:p>
+    <w:p>
+      <w:pPr>
+        <w:rPr>
+          <w:b/>
+          <w:bCs/>
+        </w:rPr>
+      </w:pPr>
+      <w:r>
+        <w:rPr>
+          <w:b/>
+          <w:bCs/>
+        </w:rPr>
+        <w:t>Embedding model</w:t>
+      </w:r>
+      <w:r>
+        <w:rPr>
+          <w:b/>
+          <w:bCs/>
+        </w:rPr>
+        <w:t xml:space="preserve">: </w:t>
+      </w:r>
+      <w:r>
+        <w:t>Text A + Text B → Measure semantic relationship</w:t>
+      </w:r>
+    </w:p>
+    <w:p/>
+    <w:p>
+      <w:pPr>
+        <w:rPr>
+          <w:b/>
+          <w:bCs/>
+        </w:rPr>
+      </w:pPr>
+      <w:r>
+        <w:rPr>
+          <w:b/>
+          <w:bCs/>
+        </w:rPr>
+        <w:t>Vector Databases</w:t>
+      </w:r>
+      <w:r>
+        <w:rPr>
+          <w:b/>
+          <w:bCs/>
+        </w:rPr>
+        <w:t>:</w:t>
+      </w:r>
+      <w:r>
+        <w:rPr>
+          <w:b/>
+          <w:bCs/>
+        </w:rPr>
+        <w:br/>
+      </w:r>
+      <w:r>
+        <w:rPr>
+          <w:b/>
+          <w:bCs/>
+        </w:rPr>
+        <w:t>1. What problem does a vector database solve?</w:t>
+      </w:r>
+    </w:p>
+    <w:p>
+      <w:r>
+        <w:t>Our previous program stored everything in Python:</w:t>
+      </w:r>
+    </w:p>
+    <w:p>
+      <w:proofErr w:type="spellStart"/>
+      <w:r>
+        <w:t>document_embeddings</w:t>
+      </w:r>
+      <w:proofErr w:type="spellEnd"/>
+      <w:r>
+        <w:t xml:space="preserve"> = []</w:t>
+      </w:r>
+    </w:p>
+    <w:p>
+      <w:r>
+        <w:t>and then compared the query against every vector:</w:t>
+      </w:r>
+    </w:p>
+    <w:p>
+      <w:r>
+        <w:t xml:space="preserve">for document, embedding in zip(documents, </w:t>
+      </w:r>
+      <w:proofErr w:type="spellStart"/>
+      <w:r>
+        <w:t>document_embeddings</w:t>
+      </w:r>
+      <w:proofErr w:type="spellEnd"/>
+      <w:r>
+        <w:t>):</w:t>
+      </w:r>
+    </w:p>
+    <w:p>
+      <w:r>
+        <w:t xml:space="preserve">    score = </w:t>
+      </w:r>
+      <w:proofErr w:type="spellStart"/>
+      <w:r>
+        <w:t>cosine_similarity</w:t>
+      </w:r>
+      <w:proofErr w:type="spellEnd"/>
+      <w:r>
+        <w:t>(</w:t>
+      </w:r>
+      <w:proofErr w:type="spellStart"/>
+      <w:r>
+        <w:t>query_embedding</w:t>
+      </w:r>
+      <w:proofErr w:type="spellEnd"/>
+      <w:r>
+        <w:t>, embedding)</w:t>
+      </w:r>
+    </w:p>
+    <w:p>
+      <w:r>
+        <w:t>That works for 5 documents.</w:t>
+      </w:r>
+    </w:p>
+    <w:p>
+      <w:r>
+        <w:t>But imagine:</w:t>
+      </w:r>
+    </w:p>
+    <w:p>
+      <w:r>
+        <w:t>10 documents       → easy</w:t>
+      </w:r>
+    </w:p>
+    <w:p>
+      <w:r>
+        <w:t>10,000 documents   → manageable</w:t>
+      </w:r>
+    </w:p>
+    <w:p>
+      <w:r>
+        <w:t>1 million          → expensive to search naively</w:t>
+      </w:r>
+    </w:p>
+    <w:p>
+      <w:r>
+        <w:t>100 million        → definitely need specialized infrastructure</w:t>
+      </w:r>
+    </w:p>
+    <w:p>
+      <w:r>
+        <w:t xml:space="preserve">A vector database is designed to </w:t>
+      </w:r>
+      <w:r>
+        <w:rPr>
+          <w:b/>
+          <w:bCs/>
+        </w:rPr>
+        <w:t>store, index, and search high-dimensional vectors efficiently</w:t>
+      </w:r>
+      <w:r>
+        <w:t>.</w:t>
+      </w:r>
+    </w:p>
+    <w:p>
+      <w:pPr>
+        <w:rPr>
+          <w:b/>
+          <w:bCs/>
+        </w:rPr>
+      </w:pPr>
+      <w:r>
+        <w:rPr>
+          <w:b/>
+          <w:bCs/>
+        </w:rPr>
+        <w:t>2. What does it actually store?</w:t>
+      </w:r>
+    </w:p>
+    <w:p>
+      <w:r>
+        <w:t>A vector database doesn't just contain:</w:t>
+      </w:r>
+    </w:p>
+    <w:p>
+      <w:r>
+        <w:t>[0.12, -0.34, 0.81, ...]</w:t>
+      </w:r>
+    </w:p>
+    <w:p>
+      <w:r>
+        <w:t>We generally store something more useful:</w:t>
+      </w:r>
+    </w:p>
+    <w:p>
+      <w:r>
+        <w:t>So conceptually:</w:t>
+      </w:r>
+    </w:p>
+    <w:tbl>
+      <w:tblPr>
+        <w:tblStyle w:val="TableGrid"/>
+        <w:tblW w:w="0" w:type="auto"/>
+        <w:jc w:val="center"/>
+        <w:tblLook w:val="04A0" w:firstRow="1" w:lastRow="0" w:firstColumn="1" w:lastColumn="0" w:noHBand="0" w:noVBand="1"/>
+      </w:tblPr>
+      <w:tblGrid>
+        <w:gridCol w:w="4544"/>
+      </w:tblGrid>
+      <w:tr>
+        <w:trPr>
+          <w:trHeight w:val="1176"/>
+          <w:jc w:val="center"/>
+        </w:trPr>
+        <w:tc>
+          <w:tcPr>
+            <w:tcW w:w="4544" w:type="dxa"/>
+          </w:tcPr>
+          <w:p/>
+          <w:p>
+            <w:r>
+              <w:t xml:space="preserve">Vector </w:t>
+            </w:r>
+          </w:p>
+          <w:p>
+            <w:r>
+              <w:t xml:space="preserve">[0.12, -0.34, 0.81, ...] </w:t>
+            </w:r>
+          </w:p>
+          <w:p/>
+        </w:tc>
+      </w:tr>
+      <w:tr>
+        <w:trPr>
+          <w:trHeight w:val="2074"/>
+          <w:jc w:val="center"/>
+        </w:trPr>
+        <w:tc>
+          <w:tcPr>
+            <w:tcW w:w="4544" w:type="dxa"/>
+          </w:tcPr>
+          <w:p/>
+          <w:p>
+            <w:r>
+              <w:t xml:space="preserve">Metadata  </w:t>
+            </w:r>
+          </w:p>
+          <w:p>
+            <w:proofErr w:type="spellStart"/>
+            <w:r>
+              <w:t>document_id</w:t>
+            </w:r>
+            <w:proofErr w:type="spellEnd"/>
+            <w:r>
+              <w:t xml:space="preserve">: 123  </w:t>
+            </w:r>
+          </w:p>
+          <w:p>
+            <w:r>
+              <w:t xml:space="preserve">source: employee_handbook.pdf  </w:t>
+            </w:r>
+          </w:p>
+          <w:p>
+            <w:r>
+              <w:t xml:space="preserve">page: 15 </w:t>
+            </w:r>
+          </w:p>
+          <w:p>
+            <w:r>
+              <w:t xml:space="preserve">department: HR </w:t>
+            </w:r>
+          </w:p>
+          <w:p/>
+        </w:tc>
+      </w:tr>
+      <w:tr>
+        <w:trPr>
+          <w:trHeight w:val="1188"/>
+          <w:jc w:val="center"/>
+        </w:trPr>
+        <w:tc>
+          <w:tcPr>
+            <w:tcW w:w="4544" w:type="dxa"/>
+          </w:tcPr>
+          <w:p/>
+          <w:p>
+            <w:r>
+              <w:t xml:space="preserve">Original content </w:t>
+            </w:r>
+          </w:p>
+          <w:p>
+            <w:r>
+              <w:t xml:space="preserve">"Employees receive 20 days..." </w:t>
+            </w:r>
+          </w:p>
+          <w:p/>
+        </w:tc>
+      </w:tr>
+    </w:tbl>
+    <w:p/>
+    <w:p>
+      <w:r>
+        <w:t>Vector + Metadata + Original text</w:t>
+      </w:r>
+      <w:r>
+        <w:t xml:space="preserve"> , </w:t>
+      </w:r>
+      <w:r>
+        <w:t>can live together.</w:t>
+      </w:r>
+    </w:p>
+    <w:p>
+      <w:pPr>
+        <w:rPr>
+          <w:b/>
+          <w:bCs/>
+        </w:rPr>
+      </w:pPr>
+      <w:r>
+        <w:rPr>
+          <w:b/>
+          <w:bCs/>
+        </w:rPr>
+        <w:t>3. What happens during search?</w:t>
+      </w:r>
+    </w:p>
+    <w:p>
+      <w:r>
+        <w:t>Suppose we have:</w:t>
+      </w:r>
+    </w:p>
+    <w:p>
+      <w:r>
+        <w:t>employee_handbook.pdf</w:t>
+      </w:r>
+    </w:p>
+    <w:p>
+      <w:r>
+        <w:t xml:space="preserve">        ↓</w:t>
+      </w:r>
+    </w:p>
+    <w:p>
+      <w:r>
+        <w:t xml:space="preserve">     chunks</w:t>
+      </w:r>
+    </w:p>
+    <w:p>
+      <w:r>
+        <w:t xml:space="preserve">        ↓</w:t>
+      </w:r>
+    </w:p>
+    <w:p>
+      <w:r>
+        <w:t xml:space="preserve">   embedding model</w:t>
+      </w:r>
+    </w:p>
+    <w:p>
+      <w:r>
+        <w:t xml:space="preserve">        ↓</w:t>
+      </w:r>
+    </w:p>
+    <w:p>
+      <w:r>
+        <w:t xml:space="preserve">     vectors</w:t>
+      </w:r>
+    </w:p>
+    <w:p>
+      <w:r>
+        <w:t xml:space="preserve">        ↓</w:t>
+      </w:r>
+    </w:p>
+    <w:p>
+      <w:r>
+        <w:t xml:space="preserve">  Vector Database</w:t>
+      </w:r>
+    </w:p>
+    <w:p>
+      <w:r>
+        <w:t>Then the user asks:</w:t>
+      </w:r>
+      <w:r>
         <w:t xml:space="preserve"> </w:t>
       </w:r>
       <w:r>
-        <w:t>Question → Generate answer</w:t>
-      </w:r>
-    </w:p>
-    <w:p>
-      <w:pPr>
-        <w:rPr>
-          <w:b/>
-          <w:bCs/>
-        </w:rPr>
-      </w:pPr>
-      <w:r>
-        <w:rPr>
-          <w:b/>
-          <w:bCs/>
-        </w:rPr>
+        <w:t>"How many vacation days do employees receive?"</w:t>
+      </w:r>
+    </w:p>
+    <w:p>
+      <w:r>
+        <w:t>We do:</w:t>
+      </w:r>
+    </w:p>
+    <w:p>
+      <w:r>
+        <w:t>Question</w:t>
+      </w:r>
+    </w:p>
+    <w:p>
+      <w:r>
+        <w:t xml:space="preserve">   ↓</w:t>
+      </w:r>
+    </w:p>
+    <w:p>
+      <w:r>
         <w:t>Embedding model</w:t>
       </w:r>
-      <w:r>
-        <w:rPr>
-          <w:b/>
-          <w:bCs/>
-        </w:rPr>
-        <w:t xml:space="preserve">: </w:t>
-      </w:r>
-      <w:r>
-        <w:t>Text A + Text B → Measure semantic relationship</w:t>
-      </w:r>
-    </w:p>
+    </w:p>
+    <w:p>
+      <w:r>
+        <w:t xml:space="preserve">   ↓</w:t>
+      </w:r>
+    </w:p>
+    <w:p>
+      <w:r>
+        <w:lastRenderedPageBreak/>
+        <w:t>Query vector</w:t>
+      </w:r>
+    </w:p>
+    <w:p>
+      <w:r>
+        <w:t xml:space="preserve">   ↓</w:t>
+      </w:r>
+    </w:p>
+    <w:p>
+      <w:r>
+        <w:t>Vector database</w:t>
+      </w:r>
+    </w:p>
+    <w:p>
+      <w:r>
+        <w:t xml:space="preserve">   ↓</w:t>
+      </w:r>
+    </w:p>
+    <w:p>
+      <w:r>
+        <w:t>Similarity search</w:t>
+      </w:r>
+    </w:p>
+    <w:p>
+      <w:r>
+        <w:t xml:space="preserve">   ↓</w:t>
+      </w:r>
+    </w:p>
+    <w:p>
+      <w:r>
+        <w:t>Top relevant chunks</w:t>
+      </w:r>
+    </w:p>
+    <w:p>
+      <w:r>
+        <w:t>For example:</w:t>
+      </w:r>
+    </w:p>
+    <w:p>
+      <w:r>
+        <w:t>1. "Employees receive 20 days of annual leave..."</w:t>
+      </w:r>
+    </w:p>
+    <w:p>
+      <w:r>
+        <w:t xml:space="preserve">   similarity = 0.89</w:t>
+      </w:r>
+    </w:p>
+    <w:p/>
+    <w:p>
+      <w:r>
+        <w:t>2. "Employees can work remotely on Fridays..."</w:t>
+      </w:r>
+    </w:p>
+    <w:p>
+      <w:r>
+        <w:t xml:space="preserve">   similarity = 0.41</w:t>
+      </w:r>
+    </w:p>
+    <w:p/>
+    <w:p>
+      <w:r>
+        <w:t>3. "The cafeteria is open..."</w:t>
+      </w:r>
+    </w:p>
+    <w:p>
+      <w:r>
+        <w:t xml:space="preserve">   similarity = 0.18</w:t>
+      </w:r>
+    </w:p>
+    <w:p>
+      <w:r>
+        <w:t xml:space="preserve">We might retrieve the </w:t>
+      </w:r>
+      <w:r>
+        <w:rPr>
+          <w:b/>
+          <w:bCs/>
+        </w:rPr>
+        <w:t>top 3</w:t>
+      </w:r>
+      <w:r>
+        <w:t xml:space="preserve"> results.</w:t>
+      </w:r>
+    </w:p>
+    <w:p>
+      <w:pPr>
+        <w:rPr>
+          <w:b/>
+          <w:bCs/>
+        </w:rPr>
+      </w:pPr>
+      <w:r>
+        <w:rPr>
+          <w:b/>
+          <w:bCs/>
+        </w:rPr>
+        <w:t>4. Vector database vs normal database</w:t>
+      </w:r>
+    </w:p>
+    <w:p>
+      <w:r>
+        <w:t>This distinction is important for interviews.</w:t>
+      </w:r>
+    </w:p>
+    <w:p>
+      <w:pPr>
+        <w:rPr>
+          <w:b/>
+          <w:bCs/>
+        </w:rPr>
+      </w:pPr>
+      <w:r>
+        <w:rPr>
+          <w:b/>
+          <w:bCs/>
+        </w:rPr>
+        <w:t>PostgreSQL / MySQL</w:t>
+      </w:r>
+    </w:p>
+    <w:p>
+      <w:r>
+        <w:t>Traditional databases are excellent for queries like:</w:t>
+      </w:r>
+    </w:p>
+    <w:p>
+      <w:r>
+        <w:t>SELECT *</w:t>
+      </w:r>
+    </w:p>
+    <w:p>
+      <w:r>
+        <w:t>FROM employees</w:t>
+      </w:r>
+    </w:p>
+    <w:p>
+      <w:r>
+        <w:t>WHERE department = 'IT';</w:t>
+      </w:r>
+    </w:p>
+    <w:p>
+      <w:r>
+        <w:t>You're asking for records satisfying explicit conditions.</w:t>
+      </w:r>
+    </w:p>
+    <w:p>
+      <w:pPr>
+        <w:rPr>
+          <w:b/>
+          <w:bCs/>
+        </w:rPr>
+      </w:pPr>
+      <w:r>
+        <w:rPr>
+          <w:b/>
+          <w:bCs/>
+        </w:rPr>
+        <w:t>Vector database</w:t>
+      </w:r>
+    </w:p>
+    <w:p>
+      <w:r>
+        <w:t>A vector database handles questions like:</w:t>
+      </w:r>
+    </w:p>
+    <w:p>
+      <w:r>
+        <w:t>"Find documents semantically similar to this question."</w:t>
+      </w:r>
+    </w:p>
+    <w:p>
+      <w:r>
+        <w:lastRenderedPageBreak/>
+        <w:t xml:space="preserve">It searches based on </w:t>
+      </w:r>
+      <w:r>
+        <w:rPr>
+          <w:b/>
+          <w:bCs/>
+        </w:rPr>
+        <w:t>vector similarity</w:t>
+      </w:r>
+      <w:r>
+        <w:t>.</w:t>
+      </w:r>
+    </w:p>
+    <w:p>
+      <w:r>
+        <w:t>So:</w:t>
+      </w:r>
+    </w:p>
+    <w:p>
+      <w:r>
+        <w:t>Traditional DB</w:t>
+      </w:r>
+    </w:p>
+    <w:p>
+      <w:r>
+        <w:t xml:space="preserve">      ↓</w:t>
+      </w:r>
+    </w:p>
+    <w:p>
+      <w:r>
+        <w:t>Exact/structured conditions</w:t>
+      </w:r>
+    </w:p>
+    <w:p/>
+    <w:p>
+      <w:r>
+        <w:t>Vector DB</w:t>
+      </w:r>
+    </w:p>
+    <w:p>
+      <w:r>
+        <w:t xml:space="preserve">      ↓</w:t>
+      </w:r>
+    </w:p>
+    <w:p>
+      <w:r>
+        <w:t>Semantic similarity</w:t>
+      </w:r>
+    </w:p>
+    <w:p>
+      <w:r>
+        <w:t>They aren't necessarily competitors.</w:t>
+      </w:r>
+    </w:p>
+    <w:p>
+      <w:r>
+        <w:t xml:space="preserve">In modern applications, you may use </w:t>
+      </w:r>
+      <w:r>
+        <w:rPr>
+          <w:b/>
+          <w:bCs/>
+        </w:rPr>
+        <w:t>both</w:t>
+      </w:r>
+      <w:r>
+        <w:t>.</w:t>
+      </w:r>
+    </w:p>
+    <w:p>
+      <w:pPr>
+        <w:rPr>
+          <w:b/>
+          <w:bCs/>
+        </w:rPr>
+      </w:pPr>
+      <w:r>
+        <w:rPr>
+          <w:b/>
+          <w:bCs/>
+        </w:rPr>
+        <w:t>5. Do we need a vector database immediately?</w:t>
+      </w:r>
+    </w:p>
+    <w:p>
+      <w:r>
+        <w:t>No.</w:t>
+      </w:r>
+    </w:p>
+    <w:p>
+      <w:r>
+        <w:t>For learning, we're going to use a lightweight option first:</w:t>
+      </w:r>
+    </w:p>
+    <w:p>
+      <w:pPr>
+        <w:rPr>
+          <w:b/>
+          <w:bCs/>
+        </w:rPr>
+      </w:pPr>
+      <w:proofErr w:type="spellStart"/>
+      <w:r>
+        <w:rPr>
+          <w:b/>
+          <w:bCs/>
+        </w:rPr>
+        <w:t>ChromaDB</w:t>
+      </w:r>
+      <w:proofErr w:type="spellEnd"/>
+    </w:p>
+    <w:p>
+      <w:r>
+        <w:t>Chroma can run locally, which makes it convenient for our project.</w:t>
+      </w:r>
+    </w:p>
+    <w:p>
+      <w:r>
+        <w:t>Our architecture will become:</w:t>
+      </w:r>
+    </w:p>
+    <w:p>
+      <w:r>
+        <w:t>Python</w:t>
+      </w:r>
+    </w:p>
+    <w:p>
+      <w:r>
+        <w:t xml:space="preserve">  ↓</w:t>
+      </w:r>
+    </w:p>
+    <w:p>
+      <w:r>
+        <w:t>Embedding model</w:t>
+      </w:r>
+    </w:p>
+    <w:p>
+      <w:r>
+        <w:t xml:space="preserve">  ↓</w:t>
+      </w:r>
+    </w:p>
+    <w:p>
+      <w:proofErr w:type="spellStart"/>
+      <w:r>
+        <w:t>ChromaDB</w:t>
+      </w:r>
+      <w:proofErr w:type="spellEnd"/>
+    </w:p>
+    <w:p>
+      <w:r>
+        <w:t xml:space="preserve">  ↓</w:t>
+      </w:r>
+    </w:p>
+    <w:p>
+      <w:r>
+        <w:t>Vector storage + retrieval</w:t>
+      </w:r>
+    </w:p>
+    <w:p/>
     <w:p/>
     <w:p/>
     <w:sectPr>

</xml_diff>